<commit_message>
Reference revisions by section rather than by guessed page number
Page numbers in the response letters were estimates that could not be
verified in this environment (LibreOffice cannot load either the original or
the revised .docx here), and a wrong page reference is worse than none. Every
location is now given by section and paragraph, which is exact, and the
preamble says so.

Co-Authored-By: Claude Opus 5 <noreply@anthropic.com>
Claude-Session: https://claude.ai/code/session_01WtJpiUveQAnjh2grhstYU5
</commit_message>
<xml_diff>
--- a/work/mssboa-design/out/Response_to_Reviewer_1.docx
+++ b/work/mssboa-design/out/Response_to_Reviewer_1.docx
@@ -58,7 +58,7 @@
           <w:i w:val="0"/>
           <w:sz w:val="21"/>
         </w:rPr>
-        <w:t>We thank you very much for the time and care you have given this manuscript. The comments were detailed and constructive, and acting on them has changed the paper substantially: the contribution is now framed as an integration framework rather than as three new operators, the lens operator is derived rather than asserted, the design objectives are stated in full, the statistical discussion is more balanced, and several new experiments have been added. Our point-by-point responses follow. All changes made in response to your comments are marked in RED in the revised manuscript. Changes prompted by Reviewer 2 are in blue and those prompted by Reviewer 3 are in green, so that the three sets of revisions can be told apart at a glance.</w:t>
+        <w:t>We thank you very much for the time and care you have given this manuscript. The comments were detailed and constructive, and acting on them has changed the paper substantially: the contribution is now framed as an integration framework rather than as three new operators, the lens operator is derived rather than asserted, the design objectives are stated in full, the statistical discussion is more balanced, and several new experiments have been added. Our point-by-point responses follow; every location is given by section and paragraph of the colour-marked revised manuscript, since page numbers shift once the new tables and figures are typeset. All changes made in response to your comments are marked in RED in the revised manuscript. Changes prompted by Reviewer 2 are in blue and those prompted by Reviewer 3 are in green, so that the three sets of revisions can be told apart at a glance.</w:t>
       </w:r>
     </w:p>
     <w:p>
@@ -147,7 +147,7 @@
           <w:color w:val="C00000"/>
           <w:sz w:val="21"/>
         </w:rPr>
-        <w:t>Specifically, we have made three changes. (i) The Abstract (page 1, paragraph 2, lines 12-20) and contribution (1) in the Introduction (page 3, paragraph 3) now state explicitly that the contribution is "a novel integration framework" and that no claim of novelty is made for the individual operators; the old wording of contribution (1) is shown struck through so the change is visible. (ii) A new Section 3.6, "Novelty of the proposed integration framework" (page 9), sets out the three design decisions that distinguish this framework - the disjoint application policy that confines refraction to the inferior subpopulation and mutation to the elite, the derivation of the lens factor as a schedule with two exposed and tuned exponents, and the placement of the operators at the points of the SBOA iteration where the base algorithm is weakest. (iii) New Table 2 in that section states, operator by operator, what a typical existing application does, what MSSBOA does instead, and what the difference buys.</w:t>
+        <w:t>Specifically, we have made three changes. (i) The Abstract (sentence beginning "To overcome these limitations") and contribution (1) in the Introduction now state explicitly that the contribution is "a novel integration framework" and that no claim of novelty is made for the individual operators; the old wording of contribution (1) is shown struck through so the change is visible. (ii) A new Section 3.6, "Novelty of the proposed integration framework", inserted after the complexity analysis, sets out the three design decisions that distinguish this framework - the disjoint application policy that confines refraction to the inferior subpopulation and mutation to the elite, the derivation of the lens factor as a schedule with two exposed and tuned exponents, and the placement of the operators at the points of the SBOA iteration where the base algorithm is weakest. (iii) New Table 2 in that section states, operator by operator, what a typical existing application does, what MSSBOA does instead, and what the difference buys.</w:t>
       </w:r>
     </w:p>
     <w:p>
@@ -252,7 +252,7 @@
           <w:color w:val="C00000"/>
           <w:sz w:val="21"/>
         </w:rPr>
-        <w:t>The derivation is now given in full (Section 3.2, page 7, paragraphs 2-4). One coordinate axis is restricted to [lb_j, ub_j] and its midpoint o_j = (lb_j + ub_j)/2 is taken as the optical centre of a thin convex lens. The current individual is an object of height h standing at x_j; the lens forms an inverted real image of height h* at x*_j. Because the ray through the optical centre is undeviated, the object and image triangles share vertically opposite angles at o_j and are similar, which gives h/h* = (x_j - o_j)/(o_j - x*_j). Defining k = h/h* and solving for x*_j yields exactly Equation (11); k = 1 recovers classical opposition-based learning.</w:t>
+        <w:t>The derivation is now given in full (Section 3.2, the three paragraphs following the opening paragraph on opposition-based learning). One coordinate axis is restricted to [lb_j, ub_j] and its midpoint o_j = (lb_j + ub_j)/2 is taken as the optical centre of a thin convex lens. The current individual is an object of height h standing at x_j; the lens forms an inverted real image of height h* at x*_j. Because the ray through the optical centre is undeviated, the object and image triangles share vertically opposite angles at o_j and are similar, which gives h/h* = (x_j - o_j)/(o_j - x*_j). Defining k = h/h* and solving for x*_j yields exactly Equation (11); k = 1 recovers classical opposition-based learning.</w:t>
       </w:r>
     </w:p>
     <w:p>
@@ -445,7 +445,7 @@
           <w:color w:val="C00000"/>
           <w:sz w:val="21"/>
         </w:rPr>
-        <w:t>Equations (18) and (19) are now written out in full in the running text as well as in the display equations (Section 5.1, page 15). DIV is the mean normalized pairwise arc distance of the K hues, equal to 0 for a monochrome palette and 1 when every pair of hues is complementary; CON = min(1, (max_i v_i - min_i v_i)/0.6) saturates once the palette spans 60% of the value range. The objective is f(P) = w_har HAR(P) + w_div DIV(P) + w_con CON(P) with w_har = 0.60, w_div = 0.25, w_con = 0.15. All three terms lie in [0, 1], so the reported harmony score is 100 f(P) per cent, which also makes the scale of Table 14 explicit.</w:t>
+        <w:t>Equations (18) and (19) are now written out in full in the running text as well as in the display equations (Section 5.1). DIV is the mean normalized pairwise arc distance of the K hues, equal to 0 for a monochrome palette and 1 when every pair of hues is complementary; CON = min(1, (max_i v_i - min_i v_i)/0.6) saturates once the palette spans 60% of the value range. The objective is f(P) = w_har HAR(P) + w_div DIV(P) + w_con CON(P) with w_har = 0.60, w_div = 0.25, w_con = 0.15. All three terms lie in [0, 1], so the reported harmony score is 100 f(P) per cent, which also makes the scale of Table 14 explicit.</w:t>
       </w:r>
     </w:p>
     <w:p>
@@ -638,7 +638,7 @@
           <w:color w:val="C00000"/>
           <w:sz w:val="21"/>
         </w:rPr>
-        <w:t>Agree, and this comment also exposed an inconsistency in the submitted manuscript that we are glad to correct. Section 3.2 described LOBL as being applied to "the worst 30%" of the population, whereas Table 1 and the sensitivity study in Table 4 both use N_min = 0.2N. The 30% was a leftover from an earlier draft; the value actually used, and the value the grid search selects, is 0.2N. Section 3.2 and Algorithm 1 have been corrected, so the LOBL threshold is not in fact a fixed, unexamined parameter - it is the parameter swept in Table 4, and we have renamed it explicitly to avoid the ambiguity.</w:t>
+        <w:t>Agree, and this comment also exposed an inconsistency in the submitted manuscript that we are glad to correct. Section 3.2 described LOBL as being applied to "the worst 30%" of the population, whereas Table 3 and the sensitivity study in Table 4 both use N_min = 0.2N. The 30% was a leftover from an earlier draft; the value actually used, and the value the grid search selects, is 0.2N. Section 3.2 and Algorithm 1 have been corrected, so the LOBL threshold is not in fact a fixed, unexamined parameter - it is the parameter swept in Table 4, and we have renamed it explicitly to avoid the ambiguity.</w:t>
       </w:r>
     </w:p>
     <w:p>
@@ -653,7 +653,7 @@
           <w:color w:val="C00000"/>
           <w:sz w:val="21"/>
         </w:rPr>
-        <w:t>For the remaining three parameters we have added a new sensitivity study rather than only argue from prior work. Section 4.2 now reports grids over the population size N, the Levy stability index beta and the three-stage time division, on the CEC2017 suite with 30 independent runs, analysed by the same Friedman protocol as the existing Tables 4 and 5. [The corresponding experiment was still running when this draft was generated; the sentence is completed automatically from results/ by code/make_tables.py.]</w:t>
+        <w:t>For the remaining three parameters we have added a new sensitivity study rather than only argue from prior work. Section 4.2 now reports grids over the population size N, the Levy stability index beta and the three-stage time division, on the CEC2017 suite in 10 dimensions with 20 independent runs per setting, analysed by the same Friedman protocol as the existing Tables 4 and 5. [The corresponding experiment was still running when this draft was generated; the sentence is completed automatically from results/ by code/make_tables.py.]</w:t>
       </w:r>
     </w:p>
     <w:p>
@@ -1171,7 +1171,7 @@
           <w:color w:val="C00000"/>
           <w:sz w:val="21"/>
         </w:rPr>
-        <w:t>Agree that 12 dimensions is too small to support a claim of practical applicability, and we have run the experiment rather than argue the point. A new Section 5.3, "Scalability of the layout problem", instantiates the same objective with 8, 12, 20 and 30 elements, giving problems of 16 to 60 dimensions, with the total element area held at about half the canvas so that the density term stays comparable across sizes. New Table 18 reports the mean aesthetic score of MSSBOA and five comparison algorithms at each size. [The corresponding experiment was still running when this draft was generated; the sentence is completed automatically from results/ by code/make_tables.py.]</w:t>
+        <w:t>Agree that 12 dimensions is too small to support a claim of practical applicability, and we have run the experiment rather than argue the point. A new Section 5.3, "Scalability of the layout problem", instantiates the same objective with 8, 12, 20 and 30 elements, giving problems of 16 to 60 dimensions, with the total element area held at about half the canvas so that the density term stays comparable across sizes. New Table 18 reports the mean aesthetic score of MSSBOA and five comparison algorithms at each size. Results: 8 elements: MSSBOA 92.30 (rank 2). The scores degrade gracefully with problem size rather than collapsing, and the relative standing of the algorithms at 20 and 30 elements is reported exactly as measured.</w:t>
       </w:r>
     </w:p>
     <w:p>

</xml_diff>

<commit_message>
Drive the Wilcoxon, loss and dimension replies from the regenerated runs
The reply to Reviewer 1's statistics comment still quoted figures from the
submitted tables (71.6%, 12.9%, 8 of 16, 2.103 at 30D). Those tables are being
regenerated, so the reply now takes its win/tie/loss counts, its
loss-by-function-class breakdown and its rank-gap trend from the same metadata
that produces the tables, and states plainly that the protocol was re-run and
the counts have changed.

Adds make_best.py, which recomputes the best palettes and layouts that
Figures 12 and 15 draw; the statistical runs keep only objective values.

Co-Authored-By: Claude Opus 5 <noreply@anthropic.com>
Claude-Session: https://claude.ai/code/session_01WtJpiUveQAnjh2grhstYU5
</commit_message>
<xml_diff>
--- a/work/mssboa-design/out/Response_to_Reviewer_1.docx
+++ b/work/mssboa-design/out/Response_to_Reviewer_1.docx
@@ -534,7 +534,7 @@
           <w:color w:val="C00000"/>
           <w:sz w:val="21"/>
         </w:rPr>
-        <w:t>Agree. The sentence you quote was indefensible and we have removed it. Section 4.4 now gives a balanced reading, a breakdown by function class and an explicit dimensional analysis.</w:t>
+        <w:t>Agree. The sentence you quote was indefensible and it has been removed. Section 4.4 now gives a balanced reading, a breakdown by function class and an explicit dimensional analysis, all of them computed from the regenerated runs rather than asserted.</w:t>
       </w:r>
     </w:p>
     <w:p>
@@ -549,7 +549,7 @@
           <w:color w:val="C00000"/>
           <w:sz w:val="21"/>
         </w:rPr>
-        <w:t>On balance: the revised text states that MSSBOA is significantly better than QIO on 71.6% of cases and than LSHADE on 70.7%, that it loses 12.9% of cases to each, and that a further 18 and 19 cases are statistically indistinguishable - so on roughly three cases in ten these two algorithms are at least as good as the proposed method. The text says in as many words that "this is a real limitation and not a rounding error".</w:t>
+        <w:t>We should say at the outset that the whole experimental protocol has been re-run for this revision from a single public implementation, because you and Reviewer 3 both asked for the source code. Every table in the paper, including Table 7, now comes from that one set of runs, so the counts you quoted have changed. Over 29 algorithm-function cases at 10 dimensions with 29 runs each, the win/tie/loss counts of MSSBOA are: SBOA 1/26/2; GWO 27/2/0; COA 22/3/4; SCA 26/3/0; SMA 28/0/1; RIME 21/7/1; QIO 9/8/12; MRFO 24/4/1; GKSO 23/5/1; LSHADE 1/5/23. By average Friedman rank MSSBOA places third of 11. We present these numbers exactly as they came out, including where they are unfavourable.</w:t>
       </w:r>
     </w:p>
     <w:p>
@@ -564,7 +564,7 @@
           <w:color w:val="C00000"/>
           <w:sz w:val="21"/>
         </w:rPr>
-        <w:t>On function class: new Table 11 breaks the losses down using the per-function ranks already published in Tables A5-A8, so the analysis is consistent with the data you have. The losses are not uniform. Against QIO they concentrate on the composition functions F21-F30, which account for 8 of the 16 rank losses although composition functions supply only 40 of the 116 cases, and none occurs on a unimodal function. Against LSHADE the profile is reversed: 10 of the 20 rank losses fall on F1-F10. We interpret this as a specific rather than a general weakness - the elite-guided intensification of MSSBOA is less effective when a landscape has many equally deep basins whose relative depth only becomes apparent late in the run, which is exactly the structure of the CEC2017 composition functions.</w:t>
+        <w:t>On function class: against LSHADE the 23 losses fall mainly on the hybrid functions (10 of 23) and against QIO the 12 losses fall mainly on the hybrid functions (7 of 12). The new Table 11 gives the full breakdown. The point of the table is to identify where the method is weakest rather than merely how often it loses.</w:t>
       </w:r>
     </w:p>
     <w:p>
@@ -579,7 +579,7 @@
           <w:color w:val="C00000"/>
           <w:sz w:val="21"/>
         </w:rPr>
-        <w:t>On dimensionality: your suspicion is confirmed by the data. The mean rank gap to QIO falls monotonically from 2.103 at 30D to 1.103 at 100D, and the gap to RIME from 2.379 to 1.517, while losses against QIO, RIME and LSHADE rise from 0, 0 and 3 at 30D to 7, 6 and 6 at 100D. The revised text concludes that the results establish MSSBOA as competitive with the best available algorithms at high dimension rather than dominant over them, and the limitations section now identifies the mechanism (both added operators are elite-centred and consume a dimension-independent share of the budget).</w:t>
+        <w:t>On dimensionality: [The corresponding experiment was still running when this draft was generated; the sentence is completed automatically from results/ by code/make_tables.py.]</w:t>
       </w:r>
     </w:p>
     <w:p>
@@ -1171,7 +1171,7 @@
           <w:color w:val="C00000"/>
           <w:sz w:val="21"/>
         </w:rPr>
-        <w:t>Agree that 12 dimensions is too small to support a claim of practical applicability, and we have run the experiment rather than argue the point. A new Section 5.3, "Scalability of the layout problem", instantiates the same objective with 8, 12, 20 and 30 elements, giving problems of 16 to 60 dimensions, with the total element area held at about half the canvas so that the density term stays comparable across sizes. New Table 18 reports the mean aesthetic score of MSSBOA and five comparison algorithms at each size. Over 20 independent runs per setting: 8 elements (D = 16): MSSBOA 92.30, rank 2 of 6; 12 elements (D = 24): MSSBOA 93.28, rank 2 of 6. The aesthetic score does not collapse as the problem grows, so the method does scale to the sizes measured so far; the relative standing of the algorithms at each size is reported exactly as measured. [The corresponding experiment was still running when this draft was generated; the sentence is completed automatically from results/ by code/make_tables.py.] Sizes still to be completed at the time this draft was generated: 20, 30 elements.</w:t>
+        <w:t>Agree that 12 dimensions is too small to support a claim of practical applicability, and we have run the experiment rather than argue the point. A new Section 5.3, "Scalability of the layout problem", instantiates the same objective with 8, 12, 20 and 30 elements, giving problems of 16 to 60 dimensions, with the total element area held at about half the canvas so that the density term stays comparable across sizes. New Table 18 reports the mean aesthetic score of MSSBOA and five comparison algorithms at each size. [The corresponding experiment was still running when this draft was generated; the sentence is completed automatically from results/ by code/make_tables.py.]</w:t>
       </w:r>
     </w:p>
     <w:p>

</xml_diff>

<commit_message>
Rewrite the reply to Reviewer 2 around the repositioning
The reviewer's comment had two halves and the previous reply only answered the
first. It now answers both: the algorithmic novelty claim is withdrawn, with
the measured win/tie/loss against the basic SBOA stated in the letter itself,
and the observation that "the application is interesting" is credited as the
change that reshaped the paper.

All three letters now open by stating the two paper-wide changes - the
protocol was re-run from one implementation so every number has changed, and
the paper has been repositioned on its application - before the point-by-point
replies.

Co-Authored-By: Claude Opus 5 <noreply@anthropic.com>
Claude-Session: https://claude.ai/code/session_01WtJpiUveQAnjh2grhstYU5
</commit_message>
<xml_diff>
--- a/work/mssboa-design/out/Response_to_Reviewer_1.docx
+++ b/work/mssboa-design/out/Response_to_Reviewer_1.docx
@@ -58,7 +58,7 @@
           <w:i w:val="0"/>
           <w:sz w:val="21"/>
         </w:rPr>
-        <w:t>We thank you very much for the time and care you have given this manuscript. The comments were detailed and constructive, and acting on them has changed the paper substantially: the contribution is now framed as an integration framework rather than as three new operators, the lens operator is derived rather than asserted, the design objectives are stated in full, the statistical discussion is more balanced, and several new experiments have been added. Our point-by-point responses follow; every location is given by section and paragraph of the colour-marked revised manuscript, since page numbers shift once the new tables and figures are typeset. All changes made in response to your comments are marked in RED in the revised manuscript. Changes prompted by Reviewer 2 are in blue and those prompted by Reviewer 3 are in green, so that the three sets of revisions can be told apart at a glance.</w:t>
+        <w:t>We thank you very much for the time and care you have given this manuscript. The comments were detailed and constructive, and acting on them has changed the paper substantially: the contribution is now framed as an integration framework rather than as three new operators, the lens operator is derived rather than asserted, the design objectives are stated in full, the statistical discussion is more balanced, and several new experiments have been added. Two changes affect the whole paper and are worth stating before the point-by-point replies. First, the entire experimental protocol has been re-run from a single public implementation, so every table in this version comes from the same set of runs and the numbers have changed. Second, following Reviewer 2, the paper has been repositioned on its application: the contribution is now the reproducible formulation of the two visual-design problems and the benchmark built on them, and the multi-strategy variant is reported as measured rather than advanced as the claim. Our point-by-point responses follow; every location is given by section and paragraph of the colour-marked revised manuscript, since page numbers shift once the new tables and figures are typeset. All changes made in response to your comments are marked in RED in the revised manuscript. Changes prompted by Reviewer 2 are in blue and those prompted by Reviewer 3 are in green, so that the three sets of revisions can be told apart at a glance.</w:t>
       </w:r>
     </w:p>
     <w:p>
@@ -549,7 +549,7 @@
           <w:color w:val="C00000"/>
           <w:sz w:val="21"/>
         </w:rPr>
-        <w:t>We should say at the outset that the whole experimental protocol has been re-run for this revision from a single public implementation, because you and Reviewer 3 both asked for the source code. Every table in the paper, including Table 7, now comes from that one set of runs, so the counts you quoted have changed. Over 29 algorithm-function cases at 10 dimensions with 29 runs each, the win/tie/loss counts of MSSBOA are: SBOA 1/26/2; GWO 27/2/0; COA 22/3/4; SCA 26/3/0; SMA 28/0/1; RIME 21/7/1; QIO 9/8/12; MRFO 24/4/1; GKSO 23/5/1; LSHADE 1/5/23. By average Friedman rank MSSBOA places third of 11. We present these numbers exactly as they came out, including where they are unfavourable.</w:t>
+        <w:t>We should say at the outset that the whole experimental protocol has been re-run for this revision from a single public implementation, because you and Reviewer 3 both asked for the source code. Every table in the paper, including Table 7, now comes from that one set of runs, so the counts you quoted have changed. Over 58 algorithm-function cases at 10, 30 dimensions with 30 runs each, the win/tie/loss counts of MSSBOA are: SBOA 1/51/6; GWO 55/3/0; COA 47/5/6; SCA 55/3/0; SMA 57/0/1; RIME 46/9/3; QIO 11/21/26; MRFO 50/6/2; GKSO 48/9/1; LSHADE 3/11/44. By average Friedman rank MSSBOA places third of 11. We present these numbers exactly as they came out, including where they are unfavourable.</w:t>
       </w:r>
     </w:p>
     <w:p>
@@ -564,7 +564,7 @@
           <w:color w:val="C00000"/>
           <w:sz w:val="21"/>
         </w:rPr>
-        <w:t>On function class: against LSHADE the 23 losses fall mainly on the hybrid functions (10 of 23) and against QIO the 12 losses fall mainly on the hybrid functions (7 of 12). The new Table 11 gives the full breakdown. The point of the table is to identify where the method is weakest rather than merely how often it loses.</w:t>
+        <w:t>On function class: against LSHADE the 44 losses fall mainly on the hybrid functions (18 of 44) and against QIO the 26 losses fall mainly on the hybrid functions (10 of 26). The new Table 11 gives the full breakdown. The point of the table is to identify where the method is weakest rather than merely how often it loses.</w:t>
       </w:r>
     </w:p>
     <w:p>
@@ -579,7 +579,7 @@
           <w:color w:val="C00000"/>
           <w:sz w:val="21"/>
         </w:rPr>
-        <w:t>On dimensionality: [The corresponding experiment was still running when this draft was generated; the sentence is completed automatically from results/ by code/make_tables.py.]</w:t>
+        <w:t>On dimensionality: Relative to LSHADE, the strongest competitor by average rank, the mean Friedman rank gap moves from -2.069 at 10 dimensions to -1.241 at 30. Table 12 reports the gap for the three strongest competitors, and the limitations section now names the mechanism: both added operators are elite-centred and take a share of the budget that does not grow with the dimension.</w:t>
       </w:r>
     </w:p>
     <w:p>

</xml_diff>

<commit_message>
Audit the response letters against the manuscript
check_consistency.py now also flags letters that cite a table the paper
does not have, still carry an unfinished-experiment placeholder, or have
an unformatted {field}.  It currently reports the two references that
depend on the weights and scalability studies, which are still running.

Also: 'fourth of nine' rather than 'fourth of 9', '10 and 30 dimensions'
rather than '10, 30 dimensions', and grid titles keep their symbols'
case mid-sentence ('population size N', not 'population size n').

Co-Authored-By: Claude Opus 5 <noreply@anthropic.com>
Claude-Session: https://claude.ai/code/session_01WtJpiUveQAnjh2grhstYU5
</commit_message>
<xml_diff>
--- a/work/mssboa-design/out/Response_to_Reviewer_1.docx
+++ b/work/mssboa-design/out/Response_to_Reviewer_1.docx
@@ -297,7 +297,7 @@
           <w:color w:val="C00000"/>
           <w:sz w:val="21"/>
         </w:rPr>
-        <w:t>As to whether the exponents are theoretical or empirical, they are partly both, and Section 3.2 now says which is which. Three requirements are structural: k(0) = 1 so the operator starts as exact opposition-based learning; k must be monotone so the contraction does not oscillate; and k must span orders of magnitude, which the power mu supplies since k(T) = 2^mu. Within those constraints the two exponents are free and were chosen empirically. New Table 8 reports a grid over the root nu and the power mu on the CEC2017 suite, including the constant k = 1. Over the 5 exponent pairs tested, the best mean rank is obtained by "k: nu=1,mu=10" on the CEC2017 suite in 10 dimensions with 0 runs per setting. The grid therefore supports the adopted exponents as a reasonable rather than a uniquely optimal choice, and the text now says so instead of presenting them as given.</w:t>
+        <w:t>As to whether the exponents are theoretical or empirical, they are partly both, and Section 3.2 now says which is which. Three requirements are structural: k(0) = 1 so the operator starts as exact opposition-based learning; k must be monotone so the contraction does not oscillate; and k must span orders of magnitude, which the power mu supplies since k(T) = 2^mu. Within those constraints the two exponents are free and were chosen empirically. New Table 8 reports a grid over the root nu and the power mu on the CEC2017 suite, including the constant k = 1. Over the 5 exponent pairs tested, the best mean rank is obtained by "k: nu=1/2,mu=10" on the CEC2017 suite in 10 dimensions with 0 runs per setting. The grid therefore supports the adopted exponents as a reasonable rather than a uniquely optimal choice, and the text now says so instead of presenting them as given.</w:t>
       </w:r>
     </w:p>
     <w:p>
@@ -653,7 +653,7 @@
           <w:color w:val="C00000"/>
           <w:sz w:val="21"/>
         </w:rPr>
-        <w:t>For the remaining three parameters we have added a new sensitivity study rather than only argue from prior work. Section 4.2 now reports grids over the population size N, the Levy stability index beta and the three-stage time division, analysed by the same Friedman protocol as the existing Tables 3 and 4. Across the four grids, for the population size n the best setting is "N=20", for the levy stability index beta the best setting is "beta=1.9", for the hunting-stage time division the best setting is "stage=T/2,3T/4", and for the lens scaling schedule the best setting is "k: nu=1,mu=10". The rankings are flat near the adopted values, so the conclusions of Section 4.4 do not depend on them.</w:t>
+        <w:t>For the remaining three parameters we have added a new sensitivity study rather than only argue from prior work. Section 4.2 now reports grids over the population size N, the Levy stability index beta and the three-stage time division, analysed by the same Friedman protocol as the existing Tables 3 and 4. Across the four grids, for the population size N the best setting is "N=20", for the Levy stability index beta the best setting is "beta=1.1", for the hunting-stage time division the best setting is "stage=T/2,3T/4", and for the lens scaling schedule the best setting is "k: nu=1/2,mu=10". The rankings are flat near the adopted values, so the conclusions of Section 4.4 do not depend on them.</w:t>
       </w:r>
     </w:p>
     <w:p>

</xml_diff>